<commit_message>
prevent Kiosk from exit
</commit_message>
<xml_diff>
--- a/docs/API_REFERENCE_UPDATED_STYLED.docx
+++ b/docs/API_REFERENCE_UPDATED_STYLED.docx
@@ -157,8 +157,8 @@
         <w:tblLook w:val="07E0" w:firstRow="1" w:lastRow="1" w:firstColumn="1" w:lastColumn="1" w:noHBand="1" w:noVBand="1"/>
       </w:tblPr>
       <w:tblGrid>
-        <w:gridCol w:w="1965"/>
-        <w:gridCol w:w="7611"/>
+        <w:gridCol w:w="1943"/>
+        <w:gridCol w:w="7633"/>
       </w:tblGrid>
       <w:tr>
         <w:trPr>
@@ -232,7 +232,31 @@
                 <w:color w:val="0000FF"/>
                 <w:u w:val="single"/>
               </w:rPr>
-              <w:t>http://127.0.0.1:5000</w:t>
+              <w:t>http://</w:t>
+            </w:r>
+            <w:r>
+              <w:rPr>
+                <w:rStyle w:val="VerbatimChar"/>
+                <w:color w:val="0000FF"/>
+                <w:u w:val="single"/>
+              </w:rPr>
+              <w:t>192.168.1.100</w:t>
+            </w:r>
+            <w:r>
+              <w:rPr>
+                <w:rStyle w:val="VerbatimChar"/>
+                <w:color w:val="0000FF"/>
+                <w:u w:val="single"/>
+              </w:rPr>
+              <w:t>:500</w:t>
+            </w:r>
+            <w:r>
+              <w:rPr>
+                <w:rStyle w:val="VerbatimChar"/>
+                <w:color w:val="0000FF"/>
+                <w:u w:val="single"/>
+              </w:rPr>
+              <w:t>1</w:t>
             </w:r>
           </w:p>
         </w:tc>
@@ -996,7 +1020,17 @@
           <w:rFonts w:ascii="Courier New" w:hAnsi="Courier New"/>
           <w:sz w:val="18"/>
         </w:rPr>
-        <w:t>Host: 127.0.0.1:5000</w:t>
+        <w:t xml:space="preserve">Host: </w:t>
+      </w:r>
+      <w:r>
+        <w:rPr>
+          <w:rStyle w:val="StringTok"/>
+          <w:rFonts w:ascii="Courier New" w:hAnsi="Courier New"/>
+          <w:color w:val="0000FF"/>
+          <w:sz w:val="18"/>
+          <w:u w:val="single"/>
+        </w:rPr>
+        <w:t>192.168.1.100:5001</w:t>
       </w:r>
     </w:p>
     <w:p>
@@ -4259,7 +4293,27 @@
           <w:sz w:val="18"/>
           <w:u w:val="single"/>
         </w:rPr>
-        <w:t>"http://127.0.0.1:5001/api/cmd/health"</w:t>
+        <w:t>"http://</w:t>
+      </w:r>
+      <w:r>
+        <w:rPr>
+          <w:rStyle w:val="StringTok"/>
+          <w:rFonts w:ascii="Courier New" w:hAnsi="Courier New"/>
+          <w:color w:val="0000FF"/>
+          <w:sz w:val="18"/>
+          <w:u w:val="single"/>
+        </w:rPr>
+        <w:t>192.168.1.100:5001</w:t>
+      </w:r>
+      <w:r>
+        <w:rPr>
+          <w:rStyle w:val="StringTok"/>
+          <w:rFonts w:ascii="Courier New" w:hAnsi="Courier New"/>
+          <w:color w:val="0000FF"/>
+          <w:sz w:val="18"/>
+          <w:u w:val="single"/>
+        </w:rPr>
+        <w:t>/api/cmd/health"</w:t>
       </w:r>
     </w:p>
     <w:p>
@@ -4610,7 +4664,27 @@
           <w:sz w:val="18"/>
           <w:u w:val="single"/>
         </w:rPr>
-        <w:t>"http://127.0.0.1:5000/"</w:t>
+        <w:t>"http://</w:t>
+      </w:r>
+      <w:r>
+        <w:rPr>
+          <w:rStyle w:val="StringTok"/>
+          <w:rFonts w:ascii="Courier New" w:hAnsi="Courier New"/>
+          <w:color w:val="0000FF"/>
+          <w:sz w:val="18"/>
+          <w:u w:val="single"/>
+        </w:rPr>
+        <w:t>192.168.1.100:5001</w:t>
+      </w:r>
+      <w:r>
+        <w:rPr>
+          <w:rStyle w:val="StringTok"/>
+          <w:rFonts w:ascii="Courier New" w:hAnsi="Courier New"/>
+          <w:color w:val="0000FF"/>
+          <w:sz w:val="18"/>
+          <w:u w:val="single"/>
+        </w:rPr>
+        <w:t>/"</w:t>
       </w:r>
     </w:p>
     <w:p>
@@ -5284,7 +5358,35 @@
           <w:sz w:val="18"/>
           <w:u w:val="single"/>
         </w:rPr>
-        <w:t>"http://127.0.0.1:5000/api/cmd/health"</w:t>
+        <w:t>"http://</w:t>
+      </w:r>
+      <w:r>
+        <w:rPr>
+          <w:rStyle w:val="BodyText"/>
+          <w:color w:val="0000FF"/>
+          <w:u w:val="single"/>
+        </w:rPr>
+        <w:t xml:space="preserve"> </w:t>
+      </w:r>
+      <w:r>
+        <w:rPr>
+          <w:rStyle w:val="StringTok"/>
+          <w:rFonts w:ascii="Courier New" w:hAnsi="Courier New"/>
+          <w:color w:val="0000FF"/>
+          <w:sz w:val="18"/>
+          <w:u w:val="single"/>
+        </w:rPr>
+        <w:t>192.168.1.100:5001</w:t>
+      </w:r>
+      <w:r>
+        <w:rPr>
+          <w:rStyle w:val="StringTok"/>
+          <w:rFonts w:ascii="Courier New" w:hAnsi="Courier New"/>
+          <w:color w:val="0000FF"/>
+          <w:sz w:val="18"/>
+          <w:u w:val="single"/>
+        </w:rPr>
+        <w:t>/api/cmd/health"</w:t>
       </w:r>
     </w:p>
     <w:p>
@@ -7065,7 +7167,27 @@
           <w:sz w:val="18"/>
           <w:u w:val="single"/>
         </w:rPr>
-        <w:t>"http://127.0.0.1:5000/api/cmd/status"</w:t>
+        <w:t>"http://</w:t>
+      </w:r>
+      <w:r>
+        <w:rPr>
+          <w:rStyle w:val="StringTok"/>
+          <w:rFonts w:ascii="Courier New" w:hAnsi="Courier New"/>
+          <w:color w:val="0000FF"/>
+          <w:sz w:val="18"/>
+          <w:u w:val="single"/>
+        </w:rPr>
+        <w:t>192.168.1.100:5001</w:t>
+      </w:r>
+      <w:r>
+        <w:rPr>
+          <w:rStyle w:val="StringTok"/>
+          <w:rFonts w:ascii="Courier New" w:hAnsi="Courier New"/>
+          <w:color w:val="0000FF"/>
+          <w:sz w:val="18"/>
+          <w:u w:val="single"/>
+        </w:rPr>
+        <w:t>/api/cmd/status"</w:t>
       </w:r>
     </w:p>
     <w:p>
@@ -8970,7 +9092,13 @@
         <w:t>Preconditions:</w:t>
       </w:r>
       <w:r>
-        <w:t xml:space="preserve"> Printer connected; otherwise </w:t>
+        <w:t xml:space="preserve"> Printer connected; </w:t>
+      </w:r>
+      <w:r>
+        <w:t>otherwise,</w:t>
+      </w:r>
+      <w:r>
+        <w:t xml:space="preserve"> </w:t>
       </w:r>
       <w:r>
         <w:rPr>
@@ -10475,6 +10603,11 @@
         <w:pStyle w:val="SourceCode"/>
         <w:shd w:val="clear" w:color="auto" w:fill="F0F0F0"/>
         <w:spacing w:after="240" w:line="276" w:lineRule="auto"/>
+        <w:rPr>
+          <w:rFonts w:ascii="Courier New" w:hAnsi="Courier New"/>
+          <w:color w:val="4070A0"/>
+          <w:sz w:val="18"/>
+        </w:rPr>
       </w:pPr>
       <w:r>
         <w:rPr>
@@ -10501,7 +10634,27 @@
           <w:sz w:val="18"/>
           <w:u w:val="single"/>
         </w:rPr>
-        <w:t>"http://127.0.0.1:5000/api/cmd/print"</w:t>
+        <w:t>"http://</w:t>
+      </w:r>
+      <w:r>
+        <w:rPr>
+          <w:rStyle w:val="StringTok"/>
+          <w:rFonts w:ascii="Courier New" w:hAnsi="Courier New"/>
+          <w:color w:val="0000FF"/>
+          <w:sz w:val="18"/>
+          <w:u w:val="single"/>
+        </w:rPr>
+        <w:t>192.168.1.100:5001</w:t>
+      </w:r>
+      <w:r>
+        <w:rPr>
+          <w:rStyle w:val="StringTok"/>
+          <w:rFonts w:ascii="Courier New" w:hAnsi="Courier New"/>
+          <w:color w:val="0000FF"/>
+          <w:sz w:val="18"/>
+          <w:u w:val="single"/>
+        </w:rPr>
+        <w:t>/api/cmd/print"</w:t>
       </w:r>
       <w:r>
         <w:rPr>
@@ -10666,7 +10819,24 @@
           <w:rFonts w:ascii="Courier New" w:hAnsi="Courier New"/>
           <w:sz w:val="18"/>
         </w:rPr>
-        <w:t>'printRequestJson={"printRequest":{"paper":"A4","scale":1,"rotation":0,"invertY":true}}'</w:t>
+        <w:t>'printRequestJson=</w:t>
+      </w:r>
+      <w:r>
+        <w:rPr>
+          <w:rFonts w:ascii="Courier New" w:hAnsi="Courier New"/>
+          <w:color w:val="4070A0"/>
+          <w:sz w:val="18"/>
+          <w:lang w:val="en-AE"/>
+        </w:rPr>
+        <w:t>{"printRequest":{"paper": "A4","width": "210mm","height":"297mm","xPosition": "13.5mm","yPosition": "-3mm","scale": 1,"rotation": 0,"invertX": true,"invertY": true}}</w:t>
+      </w:r>
+      <w:r>
+        <w:rPr>
+          <w:rStyle w:val="StringTok"/>
+          <w:rFonts w:ascii="Courier New" w:hAnsi="Courier New"/>
+          <w:sz w:val="18"/>
+        </w:rPr>
+        <w:t>'</w:t>
       </w:r>
     </w:p>
     <w:p>
@@ -13250,7 +13420,27 @@
           <w:sz w:val="18"/>
           <w:u w:val="single"/>
         </w:rPr>
-        <w:t>"http://127.0.0.1:5000/api/cmd/print/bulk"</w:t>
+        <w:t>"http://</w:t>
+      </w:r>
+      <w:r>
+        <w:rPr>
+          <w:rStyle w:val="StringTok"/>
+          <w:rFonts w:ascii="Courier New" w:hAnsi="Courier New"/>
+          <w:color w:val="0000FF"/>
+          <w:sz w:val="18"/>
+          <w:u w:val="single"/>
+        </w:rPr>
+        <w:t>192.168.1.100:5001</w:t>
+      </w:r>
+      <w:r>
+        <w:rPr>
+          <w:rStyle w:val="StringTok"/>
+          <w:rFonts w:ascii="Courier New" w:hAnsi="Courier New"/>
+          <w:color w:val="0000FF"/>
+          <w:sz w:val="18"/>
+          <w:u w:val="single"/>
+        </w:rPr>
+        <w:t>/api/cmd/print/bulk"</w:t>
       </w:r>
       <w:r>
         <w:rPr>
@@ -14967,7 +15157,27 @@
           <w:sz w:val="18"/>
           <w:u w:val="single"/>
         </w:rPr>
-        <w:t>"http://127.0.0.1:5000/api/cmd/bulk/stop"</w:t>
+        <w:t>"http://</w:t>
+      </w:r>
+      <w:r>
+        <w:rPr>
+          <w:rStyle w:val="StringTok"/>
+          <w:rFonts w:ascii="Courier New" w:hAnsi="Courier New"/>
+          <w:color w:val="0000FF"/>
+          <w:sz w:val="18"/>
+          <w:u w:val="single"/>
+        </w:rPr>
+        <w:t>192.168.1.100:5001</w:t>
+      </w:r>
+      <w:r>
+        <w:rPr>
+          <w:rStyle w:val="StringTok"/>
+          <w:rFonts w:ascii="Courier New" w:hAnsi="Courier New"/>
+          <w:color w:val="0000FF"/>
+          <w:sz w:val="18"/>
+          <w:u w:val="single"/>
+        </w:rPr>
+        <w:t>/api/cmd/bulk/stop"</w:t>
       </w:r>
       <w:r>
         <w:rPr>
@@ -16231,7 +16441,27 @@
           <w:sz w:val="18"/>
           <w:u w:val="single"/>
         </w:rPr>
-        <w:t>"http://127.0.0.1:5000/api/cmd/void"</w:t>
+        <w:t>"http://</w:t>
+      </w:r>
+      <w:r>
+        <w:rPr>
+          <w:rStyle w:val="StringTok"/>
+          <w:rFonts w:ascii="Courier New" w:hAnsi="Courier New"/>
+          <w:color w:val="0000FF"/>
+          <w:sz w:val="18"/>
+          <w:u w:val="single"/>
+        </w:rPr>
+        <w:t>192.168.1.100:5001</w:t>
+      </w:r>
+      <w:r>
+        <w:rPr>
+          <w:rStyle w:val="StringTok"/>
+          <w:rFonts w:ascii="Courier New" w:hAnsi="Courier New"/>
+          <w:color w:val="0000FF"/>
+          <w:sz w:val="18"/>
+          <w:u w:val="single"/>
+        </w:rPr>
+        <w:t>/api/cmd/void"</w:t>
       </w:r>
       <w:r>
         <w:rPr>
@@ -17204,7 +17434,27 @@
           <w:sz w:val="18"/>
           <w:u w:val="single"/>
         </w:rPr>
-        <w:t>"http://127.0.0.1:5000/api/config"</w:t>
+        <w:t>"http://</w:t>
+      </w:r>
+      <w:r>
+        <w:rPr>
+          <w:rStyle w:val="StringTok"/>
+          <w:rFonts w:ascii="Courier New" w:hAnsi="Courier New"/>
+          <w:color w:val="0000FF"/>
+          <w:sz w:val="18"/>
+          <w:u w:val="single"/>
+        </w:rPr>
+        <w:t>192.168.1.100:5001</w:t>
+      </w:r>
+      <w:r>
+        <w:rPr>
+          <w:rStyle w:val="StringTok"/>
+          <w:rFonts w:ascii="Courier New" w:hAnsi="Courier New"/>
+          <w:color w:val="0000FF"/>
+          <w:sz w:val="18"/>
+          <w:u w:val="single"/>
+        </w:rPr>
+        <w:t>/api/config"</w:t>
       </w:r>
     </w:p>
     <w:p>
@@ -18261,7 +18511,27 @@
           <w:sz w:val="18"/>
           <w:u w:val="single"/>
         </w:rPr>
-        <w:t>"http://127.0.0.1:5000/api/config/change-pen/finish"</w:t>
+        <w:t>"http://</w:t>
+      </w:r>
+      <w:r>
+        <w:rPr>
+          <w:rStyle w:val="StringTok"/>
+          <w:rFonts w:ascii="Courier New" w:hAnsi="Courier New"/>
+          <w:color w:val="0000FF"/>
+          <w:sz w:val="18"/>
+          <w:u w:val="single"/>
+        </w:rPr>
+        <w:t>192.168.1.100:5001</w:t>
+      </w:r>
+      <w:r>
+        <w:rPr>
+          <w:rStyle w:val="StringTok"/>
+          <w:rFonts w:ascii="Courier New" w:hAnsi="Courier New"/>
+          <w:color w:val="0000FF"/>
+          <w:sz w:val="18"/>
+          <w:u w:val="single"/>
+        </w:rPr>
+        <w:t>/api/config/change-pen/finish"</w:t>
       </w:r>
       <w:r>
         <w:rPr>
@@ -18769,7 +19039,27 @@
           <w:sz w:val="18"/>
           <w:u w:val="single"/>
         </w:rPr>
-        <w:t>"http://127.0.0.1:5000/api/config/change-pen"</w:t>
+        <w:t>"http://</w:t>
+      </w:r>
+      <w:r>
+        <w:rPr>
+          <w:rStyle w:val="StringTok"/>
+          <w:rFonts w:ascii="Courier New" w:hAnsi="Courier New"/>
+          <w:color w:val="0000FF"/>
+          <w:sz w:val="18"/>
+          <w:u w:val="single"/>
+        </w:rPr>
+        <w:t>192.168.1.100:5001</w:t>
+      </w:r>
+      <w:r>
+        <w:rPr>
+          <w:rStyle w:val="StringTok"/>
+          <w:rFonts w:ascii="Courier New" w:hAnsi="Courier New"/>
+          <w:color w:val="0000FF"/>
+          <w:sz w:val="18"/>
+          <w:u w:val="single"/>
+        </w:rPr>
+        <w:t>/api/config/change-pen"</w:t>
       </w:r>
       <w:r>
         <w:rPr>
@@ -19445,7 +19735,27 @@
           <w:sz w:val="18"/>
           <w:u w:val="single"/>
         </w:rPr>
-        <w:t>"http://127.0.0.1:5000/api/config/pen-distance"</w:t>
+        <w:t>"http://</w:t>
+      </w:r>
+      <w:r>
+        <w:rPr>
+          <w:rStyle w:val="StringTok"/>
+          <w:rFonts w:ascii="Courier New" w:hAnsi="Courier New"/>
+          <w:color w:val="0000FF"/>
+          <w:sz w:val="18"/>
+          <w:u w:val="single"/>
+        </w:rPr>
+        <w:t>192.168.1.100:5001</w:t>
+      </w:r>
+      <w:r>
+        <w:rPr>
+          <w:rStyle w:val="StringTok"/>
+          <w:rFonts w:ascii="Courier New" w:hAnsi="Courier New"/>
+          <w:color w:val="0000FF"/>
+          <w:sz w:val="18"/>
+          <w:u w:val="single"/>
+        </w:rPr>
+        <w:t>/api/config/pen-distance"</w:t>
       </w:r>
       <w:r>
         <w:rPr>
@@ -20010,7 +20320,27 @@
           <w:sz w:val="18"/>
           <w:u w:val="single"/>
         </w:rPr>
-        <w:t>"http://127.0.0.1:5000/api/config/pen-distance"</w:t>
+        <w:t>"http://</w:t>
+      </w:r>
+      <w:r>
+        <w:rPr>
+          <w:rStyle w:val="StringTok"/>
+          <w:rFonts w:ascii="Courier New" w:hAnsi="Courier New"/>
+          <w:color w:val="0000FF"/>
+          <w:sz w:val="18"/>
+          <w:u w:val="single"/>
+        </w:rPr>
+        <w:t>192.168.1.100:5001</w:t>
+      </w:r>
+      <w:r>
+        <w:rPr>
+          <w:rStyle w:val="StringTok"/>
+          <w:rFonts w:ascii="Courier New" w:hAnsi="Courier New"/>
+          <w:color w:val="0000FF"/>
+          <w:sz w:val="18"/>
+          <w:u w:val="single"/>
+        </w:rPr>
+        <w:t>/api/config/pen-distance"</w:t>
       </w:r>
       <w:r>
         <w:rPr>
@@ -20252,7 +20582,27 @@
           <w:sz w:val="18"/>
           <w:u w:val="single"/>
         </w:rPr>
-        <w:t>"http://127.0.0.1:5000/api/config/pen-distance"</w:t>
+        <w:t>"http://</w:t>
+      </w:r>
+      <w:r>
+        <w:rPr>
+          <w:rStyle w:val="StringTok"/>
+          <w:rFonts w:ascii="Courier New" w:hAnsi="Courier New"/>
+          <w:color w:val="0000FF"/>
+          <w:sz w:val="18"/>
+          <w:u w:val="single"/>
+        </w:rPr>
+        <w:t>192.168.1.100:5001</w:t>
+      </w:r>
+      <w:r>
+        <w:rPr>
+          <w:rStyle w:val="StringTok"/>
+          <w:rFonts w:ascii="Courier New" w:hAnsi="Courier New"/>
+          <w:color w:val="0000FF"/>
+          <w:sz w:val="18"/>
+          <w:u w:val="single"/>
+        </w:rPr>
+        <w:t>/api/config/pen-distance"</w:t>
       </w:r>
       <w:r>
         <w:rPr>
@@ -22948,7 +23298,27 @@
           <w:sz w:val="18"/>
           <w:u w:val="single"/>
         </w:rPr>
-        <w:t>"http://127.0.0.1:5000/api/config/scanner/stream.mjpg?fps=10&amp;width=640&amp;fisheye=1"</w:t>
+        <w:t>"http://</w:t>
+      </w:r>
+      <w:r>
+        <w:rPr>
+          <w:rStyle w:val="StringTok"/>
+          <w:rFonts w:ascii="Courier New" w:hAnsi="Courier New"/>
+          <w:color w:val="0000FF"/>
+          <w:sz w:val="18"/>
+          <w:u w:val="single"/>
+        </w:rPr>
+        <w:t>192.168.1.100:5001</w:t>
+      </w:r>
+      <w:r>
+        <w:rPr>
+          <w:rStyle w:val="StringTok"/>
+          <w:rFonts w:ascii="Courier New" w:hAnsi="Courier New"/>
+          <w:color w:val="0000FF"/>
+          <w:sz w:val="18"/>
+          <w:u w:val="single"/>
+        </w:rPr>
+        <w:t>/api/config/scanner/stream.mjpg?fps=10&amp;width=640&amp;fisheye=1"</w:t>
       </w:r>
       <w:r>
         <w:rPr>
@@ -23116,6 +23486,7 @@
       </w:pPr>
       <w:bookmarkStart w:id="30" w:name="config-capture"/>
       <w:r>
+        <w:lastRenderedPageBreak/>
         <w:t>Config — Capture</w:t>
       </w:r>
       <w:bookmarkEnd w:id="30"/>
@@ -23126,11 +23497,7 @@
         <w:spacing w:after="240" w:line="276" w:lineRule="auto"/>
       </w:pPr>
       <w:r>
-        <w:t xml:space="preserve">Single-step scanner rectification; applies manual session settings, runs the scanner capture pipeline server-side, and stores the rectified PNG as the latest dashboard image. The server </w:t>
-      </w:r>
-      <w:r>
-        <w:lastRenderedPageBreak/>
-        <w:t>may still expose other capture-related URLs for the built-in web UI; this section documents only the oneshot call.</w:t>
+        <w:t>Single-step scanner rectification; applies manual session settings, runs the scanner capture pipeline server-side, and stores the rectified PNG as the latest dashboard image. The server may still expose other capture-related URLs for the built-in web UI; this section documents only the oneshot call.</w:t>
       </w:r>
     </w:p>
     <w:p>
@@ -24252,6 +24619,7 @@
         <w:spacing w:after="240" w:line="276" w:lineRule="auto"/>
       </w:pPr>
       <w:r>
+        <w:lastRenderedPageBreak/>
         <w:t xml:space="preserve">Common scanner failures use </w:t>
       </w:r>
       <w:r>
@@ -24324,7 +24692,6 @@
           <w:rFonts w:ascii="Courier New" w:hAnsi="Courier New"/>
           <w:sz w:val="18"/>
         </w:rPr>
-        <w:lastRenderedPageBreak/>
         <w:t>curl</w:t>
       </w:r>
       <w:r>
@@ -24343,7 +24710,27 @@
           <w:sz w:val="18"/>
           <w:u w:val="single"/>
         </w:rPr>
-        <w:t>"http://127.0.0.1:5000/api/config/scanner/capture/oneshot"</w:t>
+        <w:t>"http://</w:t>
+      </w:r>
+      <w:r>
+        <w:rPr>
+          <w:rStyle w:val="StringTok"/>
+          <w:rFonts w:ascii="Courier New" w:hAnsi="Courier New"/>
+          <w:color w:val="0000FF"/>
+          <w:sz w:val="18"/>
+          <w:u w:val="single"/>
+        </w:rPr>
+        <w:t>192.168.1.100:5001</w:t>
+      </w:r>
+      <w:r>
+        <w:rPr>
+          <w:rStyle w:val="StringTok"/>
+          <w:rFonts w:ascii="Courier New" w:hAnsi="Courier New"/>
+          <w:color w:val="0000FF"/>
+          <w:sz w:val="18"/>
+          <w:u w:val="single"/>
+        </w:rPr>
+        <w:t>/api/config/scanner/capture/oneshot"</w:t>
       </w:r>
       <w:r>
         <w:rPr>
@@ -25788,6 +26175,7 @@
         <w:rPr>
           <w:b/>
         </w:rPr>
+        <w:lastRenderedPageBreak/>
         <w:t>Default (</w:t>
       </w:r>
       <w:r>
@@ -25934,7 +26322,27 @@
           <w:sz w:val="18"/>
           <w:u w:val="single"/>
         </w:rPr>
-        <w:t>"http://127.0.0.1:5000/api/config/print-history?days=7&amp;limit=50"</w:t>
+        <w:t>"http://</w:t>
+      </w:r>
+      <w:r>
+        <w:rPr>
+          <w:rStyle w:val="StringTok"/>
+          <w:rFonts w:ascii="Courier New" w:hAnsi="Courier New"/>
+          <w:color w:val="0000FF"/>
+          <w:sz w:val="18"/>
+          <w:u w:val="single"/>
+        </w:rPr>
+        <w:t>192.168.1.100:5001</w:t>
+      </w:r>
+      <w:r>
+        <w:rPr>
+          <w:rStyle w:val="StringTok"/>
+          <w:rFonts w:ascii="Courier New" w:hAnsi="Courier New"/>
+          <w:color w:val="0000FF"/>
+          <w:sz w:val="18"/>
+          <w:u w:val="single"/>
+        </w:rPr>
+        <w:t>/api/config/print-history?days=7&amp;limit=50"</w:t>
       </w:r>
     </w:p>
     <w:p>
@@ -25946,7 +26354,6 @@
         <w:rPr>
           <w:b/>
         </w:rPr>
-        <w:lastRenderedPageBreak/>
         <w:t>Example response</w:t>
       </w:r>
       <w:r>
@@ -26037,7 +26444,27 @@
           <w:sz w:val="18"/>
           <w:u w:val="single"/>
         </w:rPr>
-        <w:t>"http://127.0.0.1:5000/api/config/print-history?days=7&amp;limit=50&amp;compact=1"</w:t>
+        <w:t>"http://</w:t>
+      </w:r>
+      <w:r>
+        <w:rPr>
+          <w:rStyle w:val="StringTok"/>
+          <w:rFonts w:ascii="Courier New" w:hAnsi="Courier New"/>
+          <w:color w:val="0000FF"/>
+          <w:sz w:val="18"/>
+          <w:u w:val="single"/>
+        </w:rPr>
+        <w:t>192.168.1.100:5001</w:t>
+      </w:r>
+      <w:r>
+        <w:rPr>
+          <w:rStyle w:val="StringTok"/>
+          <w:rFonts w:ascii="Courier New" w:hAnsi="Courier New"/>
+          <w:color w:val="0000FF"/>
+          <w:sz w:val="18"/>
+          <w:u w:val="single"/>
+        </w:rPr>
+        <w:t>/api/config/print-history?days=7&amp;limit=50&amp;compact=1"</w:t>
       </w:r>
     </w:p>
     <w:p>
@@ -27469,6 +27896,7 @@
         <w:spacing w:after="240" w:line="276" w:lineRule="auto"/>
       </w:pPr>
       <w:r>
+        <w:lastRenderedPageBreak/>
         <w:pict w14:anchorId="79FAA21C">
           <v:rect id="_x0000_i1046" style="width:0;height:1.5pt" o:hralign="center" o:hrstd="t" o:hr="t"/>
         </w:pict>
@@ -27562,7 +27990,6 @@
               <w:pStyle w:val="Compact"/>
             </w:pPr>
             <w:r>
-              <w:lastRenderedPageBreak/>
               <w:t>Field</w:t>
             </w:r>
           </w:p>
@@ -28977,6 +29404,7 @@
       </w:pPr>
       <w:bookmarkStart w:id="37" w:name="printerstatus-as-json"/>
       <w:r>
+        <w:lastRenderedPageBreak/>
         <w:t>PrinterStatus (as JSON)</w:t>
       </w:r>
       <w:bookmarkEnd w:id="37"/>
@@ -29133,7 +29561,6 @@
               <w:rPr>
                 <w:rStyle w:val="VerbatimChar"/>
               </w:rPr>
-              <w:lastRenderedPageBreak/>
               <w:t>id</w:t>
             </w:r>
           </w:p>
@@ -29994,6 +30421,7 @@
       </w:pPr>
       <w:bookmarkStart w:id="42" w:name="configuration-group-apiconfig"/>
       <w:r>
+        <w:lastRenderedPageBreak/>
         <w:t xml:space="preserve">Configuration group — </w:t>
       </w:r>
       <w:r>
@@ -30162,7 +30590,6 @@
               <w:pStyle w:val="Compact"/>
             </w:pPr>
             <w:r>
-              <w:lastRenderedPageBreak/>
               <w:t>Method</w:t>
             </w:r>
           </w:p>
@@ -32050,7 +32477,6 @@
   <w:style w:type="character" w:default="1" w:styleId="DefaultParagraphFont">
     <w:name w:val="Default Paragraph Font"/>
     <w:uiPriority w:val="1"/>
-    <w:semiHidden/>
     <w:unhideWhenUsed/>
   </w:style>
   <w:style w:type="table" w:default="1" w:styleId="TableNormal">

</xml_diff>